<commit_message>
Corrige rutas dinamicas para local y Streamlit Cloud
</commit_message>
<xml_diff>
--- a/PROYECTO DE VISUALIZACIÓN DE DATOS.docx
+++ b/PROYECTO DE VISUALIZACIÓN DE DATOS.docx
@@ -1279,8 +1279,21 @@
       <w:r>
         <w:t xml:space="preserve">: </w:t>
       </w:r>
-      <w:r>
-        <w:t>Kaggle  - Social Media Addiction &amp; Mental Health Dataset</w:t>
+      <w:proofErr w:type="gramStart"/>
+      <w:r>
+        <w:t>Kaggle  -</w:t>
+      </w:r>
+      <w:proofErr w:type="gramEnd"/>
+      <w:r>
+        <w:t xml:space="preserve"> Social Media </w:t>
+      </w:r>
+      <w:proofErr w:type="spellStart"/>
+      <w:r>
+        <w:t>Addiction</w:t>
+      </w:r>
+      <w:proofErr w:type="spellEnd"/>
+      <w:r>
+        <w:t xml:space="preserve"> &amp; Mental Health Dataset</w:t>
       </w:r>
     </w:p>
     <w:p>
@@ -1335,7 +1348,15 @@
         <w:t>interrelacionados mediante un identificador único de usuario</w:t>
       </w:r>
       <w:r>
-        <w:t xml:space="preserve"> (id_usuario). </w:t>
+        <w:t xml:space="preserve"> (</w:t>
+      </w:r>
+      <w:proofErr w:type="spellStart"/>
+      <w:r>
+        <w:t>id_usuario</w:t>
+      </w:r>
+      <w:proofErr w:type="spellEnd"/>
+      <w:r>
+        <w:t xml:space="preserve">). </w:t>
       </w:r>
       <w:r>
         <w:t xml:space="preserve">De estos, se seleccionaron 4 archivos CSV por contener la información más relevante para el análisis y la visualización de los indicadores asociados al uso de redes sociales y su impacto en la salud mental. </w:t>
@@ -1571,6 +1592,7 @@
                 <w:szCs w:val="18"/>
               </w:rPr>
             </w:pPr>
+            <w:proofErr w:type="spellStart"/>
             <w:r>
               <w:rPr>
                 <w:sz w:val="18"/>
@@ -1578,6 +1600,7 @@
               </w:rPr>
               <w:t>mental_health_trends</w:t>
             </w:r>
+            <w:proofErr w:type="spellEnd"/>
           </w:p>
         </w:tc>
         <w:tc>
@@ -1722,6 +1745,7 @@
                 <w:szCs w:val="18"/>
               </w:rPr>
             </w:pPr>
+            <w:proofErr w:type="spellStart"/>
             <w:r>
               <w:rPr>
                 <w:sz w:val="18"/>
@@ -1729,6 +1753,7 @@
               </w:rPr>
               <w:t>social_media_usage</w:t>
             </w:r>
+            <w:proofErr w:type="spellEnd"/>
           </w:p>
         </w:tc>
         <w:tc>
@@ -1859,6 +1884,7 @@
                 <w:szCs w:val="18"/>
               </w:rPr>
             </w:pPr>
+            <w:proofErr w:type="spellStart"/>
             <w:r>
               <w:rPr>
                 <w:sz w:val="18"/>
@@ -1866,6 +1892,7 @@
               </w:rPr>
               <w:t>dopamine_trigger_metrics</w:t>
             </w:r>
+            <w:proofErr w:type="spellEnd"/>
           </w:p>
         </w:tc>
         <w:tc>
@@ -1996,6 +2023,7 @@
                 <w:szCs w:val="18"/>
               </w:rPr>
             </w:pPr>
+            <w:proofErr w:type="spellStart"/>
             <w:r>
               <w:rPr>
                 <w:sz w:val="18"/>
@@ -2003,6 +2031,7 @@
               </w:rPr>
               <w:t>sleep_disruption</w:t>
             </w:r>
+            <w:proofErr w:type="spellEnd"/>
           </w:p>
         </w:tc>
         <w:tc>
@@ -2682,7 +2711,39 @@
                 <w:szCs w:val="18"/>
               </w:rPr>
               <w:lastRenderedPageBreak/>
-              <w:t>Indonesia, Japan, Mexico, Nigeria, Pakistan, Russia, Saudi Arabia, South Korea, Spain, Turkey, UK, USA</w:t>
+              <w:t xml:space="preserve">Indonesia, Japan, Mexico, Nigeria, </w:t>
+            </w:r>
+            <w:proofErr w:type="spellStart"/>
+            <w:r>
+              <w:rPr>
+                <w:sz w:val="18"/>
+                <w:szCs w:val="18"/>
+              </w:rPr>
+              <w:t>Pakistan</w:t>
+            </w:r>
+            <w:proofErr w:type="spellEnd"/>
+            <w:r>
+              <w:rPr>
+                <w:sz w:val="18"/>
+                <w:szCs w:val="18"/>
+              </w:rPr>
+              <w:t xml:space="preserve">, Russia, Saudi Arabia, South Korea, Spain, </w:t>
+            </w:r>
+            <w:proofErr w:type="spellStart"/>
+            <w:r>
+              <w:rPr>
+                <w:sz w:val="18"/>
+                <w:szCs w:val="18"/>
+              </w:rPr>
+              <w:t>Turkey</w:t>
+            </w:r>
+            <w:proofErr w:type="spellEnd"/>
+            <w:r>
+              <w:rPr>
+                <w:sz w:val="18"/>
+                <w:szCs w:val="18"/>
+              </w:rPr>
+              <w:t>, UK, USA</w:t>
             </w:r>
           </w:p>
         </w:tc>
@@ -2793,12 +2854,53 @@
                 <w:szCs w:val="18"/>
               </w:rPr>
             </w:pPr>
-            <w:r>
-              <w:rPr>
-                <w:sz w:val="18"/>
-                <w:szCs w:val="18"/>
-              </w:rPr>
-              <w:t xml:space="preserve">Children, Teen, Young Adult, Adult, Senior </w:t>
+            <w:proofErr w:type="spellStart"/>
+            <w:r>
+              <w:rPr>
+                <w:sz w:val="18"/>
+                <w:szCs w:val="18"/>
+              </w:rPr>
+              <w:t>Children</w:t>
+            </w:r>
+            <w:proofErr w:type="spellEnd"/>
+            <w:r>
+              <w:rPr>
+                <w:sz w:val="18"/>
+                <w:szCs w:val="18"/>
+              </w:rPr>
+              <w:t xml:space="preserve">, Teen, Young </w:t>
+            </w:r>
+            <w:proofErr w:type="spellStart"/>
+            <w:r>
+              <w:rPr>
+                <w:sz w:val="18"/>
+                <w:szCs w:val="18"/>
+              </w:rPr>
+              <w:t>Adult</w:t>
+            </w:r>
+            <w:proofErr w:type="spellEnd"/>
+            <w:r>
+              <w:rPr>
+                <w:sz w:val="18"/>
+                <w:szCs w:val="18"/>
+              </w:rPr>
+              <w:t xml:space="preserve">, </w:t>
+            </w:r>
+            <w:proofErr w:type="spellStart"/>
+            <w:r>
+              <w:rPr>
+                <w:sz w:val="18"/>
+                <w:szCs w:val="18"/>
+              </w:rPr>
+              <w:t>Adult</w:t>
+            </w:r>
+            <w:proofErr w:type="spellEnd"/>
+            <w:r>
+              <w:rPr>
+                <w:sz w:val="18"/>
+                <w:szCs w:val="18"/>
+              </w:rPr>
+              <w:t xml:space="preserve">, Senior </w:t>
             </w:r>
           </w:p>
         </w:tc>
@@ -3023,12 +3125,37 @@
                 <w:szCs w:val="18"/>
               </w:rPr>
             </w:pPr>
-            <w:r>
-              <w:rPr>
-                <w:sz w:val="18"/>
-                <w:szCs w:val="18"/>
-              </w:rPr>
-              <w:t>Discord, Facebook, Instagram, LinkedIn, Reddit, Snapchat, TikTok, Twitch, X/Twitter, YouTube</w:t>
+            <w:proofErr w:type="spellStart"/>
+            <w:r>
+              <w:rPr>
+                <w:sz w:val="18"/>
+                <w:szCs w:val="18"/>
+              </w:rPr>
+              <w:t>Discord</w:t>
+            </w:r>
+            <w:proofErr w:type="spellEnd"/>
+            <w:r>
+              <w:rPr>
+                <w:sz w:val="18"/>
+                <w:szCs w:val="18"/>
+              </w:rPr>
+              <w:t xml:space="preserve">, Facebook, Instagram, LinkedIn, Reddit, Snapchat, TikTok, </w:t>
+            </w:r>
+            <w:proofErr w:type="spellStart"/>
+            <w:r>
+              <w:rPr>
+                <w:sz w:val="18"/>
+                <w:szCs w:val="18"/>
+              </w:rPr>
+              <w:t>Twitch</w:t>
+            </w:r>
+            <w:proofErr w:type="spellEnd"/>
+            <w:r>
+              <w:rPr>
+                <w:sz w:val="18"/>
+                <w:szCs w:val="18"/>
+              </w:rPr>
+              <w:t>, X/Twitter, YouTube</w:t>
             </w:r>
           </w:p>
         </w:tc>
@@ -5087,7 +5214,23 @@
                 <w:sz w:val="18"/>
                 <w:szCs w:val="18"/>
               </w:rPr>
-              <w:t>Exposición recomend. IA</w:t>
+              <w:t xml:space="preserve">Exposición </w:t>
+            </w:r>
+            <w:proofErr w:type="spellStart"/>
+            <w:r>
+              <w:rPr>
+                <w:sz w:val="18"/>
+                <w:szCs w:val="18"/>
+              </w:rPr>
+              <w:t>recomend</w:t>
+            </w:r>
+            <w:proofErr w:type="spellEnd"/>
+            <w:r>
+              <w:rPr>
+                <w:sz w:val="18"/>
+                <w:szCs w:val="18"/>
+              </w:rPr>
+              <w:t>. IA</w:t>
             </w:r>
           </w:p>
         </w:tc>
@@ -8276,8 +8419,33 @@
                 <w:sz w:val="18"/>
                 <w:szCs w:val="18"/>
               </w:rPr>
-              <w:t>Conversión de id_usuario a string</w:t>
-            </w:r>
+              <w:t xml:space="preserve">Conversión de </w:t>
+            </w:r>
+            <w:proofErr w:type="spellStart"/>
+            <w:r>
+              <w:rPr>
+                <w:sz w:val="18"/>
+                <w:szCs w:val="18"/>
+              </w:rPr>
+              <w:t>id_usuario</w:t>
+            </w:r>
+            <w:proofErr w:type="spellEnd"/>
+            <w:r>
+              <w:rPr>
+                <w:sz w:val="18"/>
+                <w:szCs w:val="18"/>
+              </w:rPr>
+              <w:t xml:space="preserve"> a </w:t>
+            </w:r>
+            <w:proofErr w:type="spellStart"/>
+            <w:r>
+              <w:rPr>
+                <w:sz w:val="18"/>
+                <w:szCs w:val="18"/>
+              </w:rPr>
+              <w:t>string</w:t>
+            </w:r>
+            <w:proofErr w:type="spellEnd"/>
           </w:p>
         </w:tc>
         <w:tc>
@@ -8391,7 +8559,71 @@
                 <w:sz w:val="18"/>
                 <w:szCs w:val="18"/>
               </w:rPr>
-              <w:t>Se eliminaron columnas cuya unidad de medida no estaba documentada: content_refresh_frequency (dopamine_trigger_metrics) y night_notifications (sleep_disruption).</w:t>
+              <w:t xml:space="preserve">Se eliminaron columnas cuya unidad de medida no estaba documentada: </w:t>
+            </w:r>
+            <w:proofErr w:type="spellStart"/>
+            <w:r>
+              <w:rPr>
+                <w:sz w:val="18"/>
+                <w:szCs w:val="18"/>
+              </w:rPr>
+              <w:t>content_refresh_frequency</w:t>
+            </w:r>
+            <w:proofErr w:type="spellEnd"/>
+            <w:r>
+              <w:rPr>
+                <w:sz w:val="18"/>
+                <w:szCs w:val="18"/>
+              </w:rPr>
+              <w:t xml:space="preserve"> (</w:t>
+            </w:r>
+            <w:proofErr w:type="spellStart"/>
+            <w:r>
+              <w:rPr>
+                <w:sz w:val="18"/>
+                <w:szCs w:val="18"/>
+              </w:rPr>
+              <w:t>dopamine_trigger_metrics</w:t>
+            </w:r>
+            <w:proofErr w:type="spellEnd"/>
+            <w:r>
+              <w:rPr>
+                <w:sz w:val="18"/>
+                <w:szCs w:val="18"/>
+              </w:rPr>
+              <w:t xml:space="preserve">) y </w:t>
+            </w:r>
+            <w:proofErr w:type="spellStart"/>
+            <w:r>
+              <w:rPr>
+                <w:sz w:val="18"/>
+                <w:szCs w:val="18"/>
+              </w:rPr>
+              <w:t>night_notifications</w:t>
+            </w:r>
+            <w:proofErr w:type="spellEnd"/>
+            <w:r>
+              <w:rPr>
+                <w:sz w:val="18"/>
+                <w:szCs w:val="18"/>
+              </w:rPr>
+              <w:t xml:space="preserve"> (</w:t>
+            </w:r>
+            <w:proofErr w:type="spellStart"/>
+            <w:r>
+              <w:rPr>
+                <w:sz w:val="18"/>
+                <w:szCs w:val="18"/>
+              </w:rPr>
+              <w:t>sleep_disruption</w:t>
+            </w:r>
+            <w:proofErr w:type="spellEnd"/>
+            <w:r>
+              <w:rPr>
+                <w:sz w:val="18"/>
+                <w:szCs w:val="18"/>
+              </w:rPr>
+              <w:t>).</w:t>
             </w:r>
           </w:p>
         </w:tc>
@@ -8438,7 +8670,55 @@
                 <w:sz w:val="18"/>
                 <w:szCs w:val="18"/>
               </w:rPr>
-              <w:t>Se eliminaron notification_checks_per_day y digital_detox_attempts de social_media_usage por redundancia con otros datasets.</w:t>
+              <w:t xml:space="preserve">Se eliminaron </w:t>
+            </w:r>
+            <w:proofErr w:type="spellStart"/>
+            <w:r>
+              <w:rPr>
+                <w:sz w:val="18"/>
+                <w:szCs w:val="18"/>
+              </w:rPr>
+              <w:t>notification_checks_per_day</w:t>
+            </w:r>
+            <w:proofErr w:type="spellEnd"/>
+            <w:r>
+              <w:rPr>
+                <w:sz w:val="18"/>
+                <w:szCs w:val="18"/>
+              </w:rPr>
+              <w:t xml:space="preserve"> y </w:t>
+            </w:r>
+            <w:proofErr w:type="spellStart"/>
+            <w:r>
+              <w:rPr>
+                <w:sz w:val="18"/>
+                <w:szCs w:val="18"/>
+              </w:rPr>
+              <w:t>digital_detox_attempts</w:t>
+            </w:r>
+            <w:proofErr w:type="spellEnd"/>
+            <w:r>
+              <w:rPr>
+                <w:sz w:val="18"/>
+                <w:szCs w:val="18"/>
+              </w:rPr>
+              <w:t xml:space="preserve"> de </w:t>
+            </w:r>
+            <w:proofErr w:type="spellStart"/>
+            <w:r>
+              <w:rPr>
+                <w:sz w:val="18"/>
+                <w:szCs w:val="18"/>
+              </w:rPr>
+              <w:t>social_media_usage</w:t>
+            </w:r>
+            <w:proofErr w:type="spellEnd"/>
+            <w:r>
+              <w:rPr>
+                <w:sz w:val="18"/>
+                <w:szCs w:val="18"/>
+              </w:rPr>
+              <w:t xml:space="preserve"> por redundancia con otros datasets.</w:t>
             </w:r>
           </w:p>
         </w:tc>
@@ -10714,7 +10994,23 @@
                 <w:sz w:val="18"/>
                 <w:szCs w:val="18"/>
               </w:rPr>
-              <w:t>Exposición recomend. IA</w:t>
+              <w:t xml:space="preserve">Exposición </w:t>
+            </w:r>
+            <w:proofErr w:type="spellStart"/>
+            <w:r>
+              <w:rPr>
+                <w:sz w:val="18"/>
+                <w:szCs w:val="18"/>
+              </w:rPr>
+              <w:t>recomend</w:t>
+            </w:r>
+            <w:proofErr w:type="spellEnd"/>
+            <w:r>
+              <w:rPr>
+                <w:sz w:val="18"/>
+                <w:szCs w:val="18"/>
+              </w:rPr>
+              <w:t>. IA</w:t>
             </w:r>
           </w:p>
         </w:tc>
@@ -11256,9 +11552,11 @@
           <w:numId w:val="5"/>
         </w:numPr>
       </w:pPr>
+      <w:proofErr w:type="spellStart"/>
       <w:r>
         <w:t>Puntaje_ansiedad</w:t>
       </w:r>
+      <w:proofErr w:type="spellEnd"/>
     </w:p>
     <w:p>
       <w:pPr>
@@ -11268,9 +11566,11 @@
           <w:numId w:val="5"/>
         </w:numPr>
       </w:pPr>
+      <w:proofErr w:type="spellStart"/>
       <w:r>
         <w:t>Puntaje_depresion</w:t>
       </w:r>
+      <w:proofErr w:type="spellEnd"/>
     </w:p>
     <w:p>
       <w:pPr>
@@ -11317,9 +11617,11 @@
           <w:numId w:val="6"/>
         </w:numPr>
       </w:pPr>
+      <w:proofErr w:type="spellStart"/>
       <w:r>
         <w:t>Horas_pantalla_diaria</w:t>
       </w:r>
+      <w:proofErr w:type="spellEnd"/>
     </w:p>
     <w:p>
       <w:pPr>
@@ -11329,9 +11631,11 @@
           <w:numId w:val="6"/>
         </w:numPr>
       </w:pPr>
+      <w:proofErr w:type="spellStart"/>
       <w:r>
         <w:t>Puntaje_ansiedad</w:t>
       </w:r>
+      <w:proofErr w:type="spellEnd"/>
     </w:p>
     <w:p>
       <w:pPr>
@@ -11341,9 +11645,11 @@
           <w:numId w:val="6"/>
         </w:numPr>
       </w:pPr>
+      <w:proofErr w:type="spellStart"/>
       <w:r>
         <w:t>Puntaje_depresion</w:t>
       </w:r>
+      <w:proofErr w:type="spellEnd"/>
     </w:p>
     <w:p>
       <w:pPr>
@@ -11390,9 +11696,11 @@
           <w:numId w:val="7"/>
         </w:numPr>
       </w:pPr>
+      <w:proofErr w:type="spellStart"/>
       <w:r>
         <w:t>Grupo_edad</w:t>
       </w:r>
+      <w:proofErr w:type="spellEnd"/>
     </w:p>
     <w:p>
       <w:pPr>
@@ -11402,9 +11710,11 @@
           <w:numId w:val="7"/>
         </w:numPr>
       </w:pPr>
+      <w:proofErr w:type="spellStart"/>
       <w:r>
         <w:t>Nivel_riesgo_adiccion</w:t>
       </w:r>
+      <w:proofErr w:type="spellEnd"/>
     </w:p>
     <w:p>
       <w:pPr>
@@ -11414,9 +11724,11 @@
           <w:numId w:val="7"/>
         </w:numPr>
       </w:pPr>
+      <w:proofErr w:type="spellStart"/>
       <w:r>
         <w:t>Horas_pantalla_diaria</w:t>
       </w:r>
+      <w:proofErr w:type="spellEnd"/>
     </w:p>
     <w:p>
       <w:pPr>
@@ -11462,9 +11774,11 @@
           <w:numId w:val="8"/>
         </w:numPr>
       </w:pPr>
+      <w:proofErr w:type="spellStart"/>
       <w:r>
         <w:t>Riego_salud_mental</w:t>
       </w:r>
+      <w:proofErr w:type="spellEnd"/>
     </w:p>
     <w:p>
       <w:pPr>
@@ -11474,9 +11788,11 @@
           <w:numId w:val="8"/>
         </w:numPr>
       </w:pPr>
+      <w:proofErr w:type="spellStart"/>
       <w:r>
         <w:t>Pais</w:t>
       </w:r>
+      <w:proofErr w:type="spellEnd"/>
     </w:p>
     <w:p>
       <w:pPr>
@@ -11486,9 +11802,11 @@
           <w:numId w:val="8"/>
         </w:numPr>
       </w:pPr>
+      <w:proofErr w:type="spellStart"/>
       <w:r>
         <w:t>Grupo_edad</w:t>
       </w:r>
+      <w:proofErr w:type="spellEnd"/>
     </w:p>
     <w:p>
       <w:pPr>
@@ -11537,9 +11855,11 @@
           <w:numId w:val="9"/>
         </w:numPr>
       </w:pPr>
+      <w:proofErr w:type="spellStart"/>
       <w:r>
         <w:t>horas_consumo_video_corto</w:t>
       </w:r>
+      <w:proofErr w:type="spellEnd"/>
     </w:p>
     <w:p>
       <w:pPr>
@@ -11549,9 +11869,11 @@
           <w:numId w:val="9"/>
         </w:numPr>
       </w:pPr>
+      <w:proofErr w:type="spellStart"/>
       <w:r>
         <w:t>puntaje_activacion_dopamina</w:t>
       </w:r>
+      <w:proofErr w:type="spellEnd"/>
     </w:p>
     <w:p>
       <w:pPr>
@@ -11561,9 +11883,11 @@
           <w:numId w:val="9"/>
         </w:numPr>
       </w:pPr>
+      <w:proofErr w:type="spellStart"/>
       <w:r>
         <w:t>dependencia_gratificacion_inmediat</w:t>
       </w:r>
+      <w:proofErr w:type="spellEnd"/>
     </w:p>
     <w:p>
       <w:pPr>
@@ -12045,7 +12369,35 @@
         <w:rPr>
           <w:rFonts w:cs="Calibri Light"/>
         </w:rPr>
-        <w:t>Gráfico de dispersión (scatter plot) donde el eje X representa el Índice de Bienestar Digital y el eje Y la Brecha Autoestima-Ansiedad, ambos atributos derivados. Cada punto corresponde a un registro individual.</w:t>
+        <w:t>Gráfico de dispersión (</w:t>
+      </w:r>
+      <w:proofErr w:type="spellStart"/>
+      <w:r>
+        <w:rPr>
+          <w:rFonts w:cs="Calibri Light"/>
+        </w:rPr>
+        <w:t>scatter</w:t>
+      </w:r>
+      <w:proofErr w:type="spellEnd"/>
+      <w:r>
+        <w:rPr>
+          <w:rFonts w:cs="Calibri Light"/>
+        </w:rPr>
+        <w:t xml:space="preserve"> </w:t>
+      </w:r>
+      <w:proofErr w:type="spellStart"/>
+      <w:r>
+        <w:rPr>
+          <w:rFonts w:cs="Calibri Light"/>
+        </w:rPr>
+        <w:t>plot</w:t>
+      </w:r>
+      <w:proofErr w:type="spellEnd"/>
+      <w:r>
+        <w:rPr>
+          <w:rFonts w:cs="Calibri Light"/>
+        </w:rPr>
+        <w:t>) donde el eje X representa el Índice de Bienestar Digital y el eje Y la Brecha Autoestima-Ansiedad, ambos atributos derivados. Cada punto corresponde a un registro individual.</w:t>
       </w:r>
     </w:p>
     <w:p>
@@ -12222,7 +12574,49 @@
         <w:rPr>
           <w:rFonts w:cs="Calibri Light"/>
         </w:rPr>
-        <w:t>Gráfico de barras agrupadas donde el eje X representa los grupos etarios (Children, Teen, Young Adult, Adult y Senior) y el eje Y el nivel promedio de apoyo clínico. Dentro de cada grupo etario, las barras se agrupan por género, permitiendo comparar las diferencias entre categorías de forma directa.</w:t>
+        <w:t>Gráfico de barras agrupadas donde el eje X representa los grupos etarios (</w:t>
+      </w:r>
+      <w:proofErr w:type="spellStart"/>
+      <w:r>
+        <w:rPr>
+          <w:rFonts w:cs="Calibri Light"/>
+        </w:rPr>
+        <w:t>Children</w:t>
+      </w:r>
+      <w:proofErr w:type="spellEnd"/>
+      <w:r>
+        <w:rPr>
+          <w:rFonts w:cs="Calibri Light"/>
+        </w:rPr>
+        <w:t xml:space="preserve">, Teen, Young </w:t>
+      </w:r>
+      <w:proofErr w:type="spellStart"/>
+      <w:r>
+        <w:rPr>
+          <w:rFonts w:cs="Calibri Light"/>
+        </w:rPr>
+        <w:t>Adult</w:t>
+      </w:r>
+      <w:proofErr w:type="spellEnd"/>
+      <w:r>
+        <w:rPr>
+          <w:rFonts w:cs="Calibri Light"/>
+        </w:rPr>
+        <w:t xml:space="preserve">, </w:t>
+      </w:r>
+      <w:proofErr w:type="spellStart"/>
+      <w:r>
+        <w:rPr>
+          <w:rFonts w:cs="Calibri Light"/>
+        </w:rPr>
+        <w:t>Adult</w:t>
+      </w:r>
+      <w:proofErr w:type="spellEnd"/>
+      <w:r>
+        <w:rPr>
+          <w:rFonts w:cs="Calibri Light"/>
+        </w:rPr>
+        <w:t xml:space="preserve"> y Senior) y el eje Y el nivel promedio de apoyo clínico. Dentro de cada grupo etario, las barras se agrupan por género, permitiendo comparar las diferencias entre categorías de forma directa.</w:t>
       </w:r>
     </w:p>
     <w:p>
@@ -12520,7 +12914,7 @@
           <w:rFonts w:ascii="Calibri" w:hAnsi="Calibri" w:cs="Calibri"/>
           <w:b/>
           <w:bCs/>
-          <w:lang w:val="es-ES"/>
+          <w:lang w:val="en-US"/>
         </w:rPr>
       </w:pPr>
       <w:r>
@@ -12528,26 +12922,56 @@
           <w:rFonts w:ascii="Calibri" w:hAnsi="Calibri" w:cs="Calibri"/>
           <w:b/>
           <w:bCs/>
-          <w:lang w:val="es-ES"/>
-        </w:rPr>
-        <w:br w:type="page"/>
-      </w:r>
-    </w:p>
-    <w:p>
-      <w:pPr>
+          <w:lang w:val="en-US"/>
+        </w:rPr>
+        <w:t xml:space="preserve">ENLACE: </w:t>
+      </w:r>
+      <w:hyperlink r:id="rId16" w:history="1">
+        <w:r>
+          <w:rPr>
+            <w:rStyle w:val="Hipervnculo"/>
+            <w:rFonts w:ascii="Calibri" w:hAnsi="Calibri" w:cs="Calibri"/>
+            <w:b/>
+            <w:bCs/>
+            <w:lang w:val="en-US"/>
+          </w:rPr>
+          <w:t>https://proyectovd2026-wm53fxowkzwdklkrwpjtjw.streamlit.app/</w:t>
+        </w:r>
+      </w:hyperlink>
+      <w:r>
         <w:rPr>
           <w:rFonts w:ascii="Calibri" w:hAnsi="Calibri" w:cs="Calibri"/>
           <w:b/>
           <w:bCs/>
-          <w:lang w:val="es-ES"/>
-        </w:rPr>
-      </w:pPr>
+          <w:lang w:val="en-US"/>
+        </w:rPr>
+        <w:t xml:space="preserve"> </w:t>
+      </w:r>
       <w:r>
         <w:rPr>
           <w:rFonts w:ascii="Calibri" w:hAnsi="Calibri" w:cs="Calibri"/>
           <w:b/>
           <w:bCs/>
-          <w:lang w:val="es-ES"/>
+          <w:lang w:val="en-US"/>
+        </w:rPr>
+        <w:br w:type="page"/>
+      </w:r>
+    </w:p>
+    <w:p>
+      <w:pPr>
+        <w:rPr>
+          <w:rFonts w:ascii="Calibri" w:hAnsi="Calibri" w:cs="Calibri"/>
+          <w:b/>
+          <w:bCs/>
+          <w:lang w:val="en-US"/>
+        </w:rPr>
+      </w:pPr>
+      <w:r>
+        <w:rPr>
+          <w:rFonts w:ascii="Calibri" w:hAnsi="Calibri" w:cs="Calibri"/>
+          <w:b/>
+          <w:bCs/>
+          <w:lang w:val="en-US"/>
         </w:rPr>
         <w:lastRenderedPageBreak/>
         <w:t>ANEXO</w:t>
@@ -12585,7 +13009,7 @@
                     <pic:cNvPicPr/>
                   </pic:nvPicPr>
                   <pic:blipFill>
-                    <a:blip r:embed="rId16"/>
+                    <a:blip r:embed="rId17"/>
                     <a:stretch>
                       <a:fillRect/>
                     </a:stretch>
@@ -12638,7 +13062,7 @@
                     <pic:cNvPicPr/>
                   </pic:nvPicPr>
                   <pic:blipFill>
-                    <a:blip r:embed="rId17"/>
+                    <a:blip r:embed="rId18"/>
                     <a:stretch>
                       <a:fillRect/>
                     </a:stretch>
@@ -12691,7 +13115,7 @@
                     <pic:cNvPicPr/>
                   </pic:nvPicPr>
                   <pic:blipFill>
-                    <a:blip r:embed="rId18"/>
+                    <a:blip r:embed="rId19"/>
                     <a:stretch>
                       <a:fillRect/>
                     </a:stretch>
@@ -12745,7 +13169,7 @@
                     <pic:cNvPicPr/>
                   </pic:nvPicPr>
                   <pic:blipFill>
-                    <a:blip r:embed="rId19"/>
+                    <a:blip r:embed="rId20"/>
                     <a:stretch>
                       <a:fillRect/>
                     </a:stretch>
@@ -12798,7 +13222,7 @@
                     <pic:cNvPicPr/>
                   </pic:nvPicPr>
                   <pic:blipFill>
-                    <a:blip r:embed="rId20"/>
+                    <a:blip r:embed="rId21"/>
                     <a:stretch>
                       <a:fillRect/>
                     </a:stretch>

</xml_diff>